<commit_message>
Publish editorial travel and tourism portfolio with career evidence
</commit_message>
<xml_diff>
--- a/documents/Ahmed-Mahmoud-Managerial-CV.docx
+++ b/documents/Ahmed-Mahmoud-Managerial-CV.docx
@@ -4,741 +4,194 @@
   <w:body>
     <w:p>
       <w:pPr>
-        <w:spacing w:after="20"/>
+        <w:pStyle w:val="Title"/>
       </w:pPr>
       <w:r>
+        <w:t>Ahmed Mahmoud</w:t>
+      </w:r>
+    </w:p>
+    <w:p>
+      <w:r>
         <w:rPr>
-          <w:rFonts w:ascii="Arial" w:hAnsi="Arial"/>
           <w:b/>
-          <w:i w:val="0"/>
-          <w:color w:val="071A32"/>
-          <w:sz w:val="44"/>
+          <w:sz w:val="26"/>
         </w:rPr>
-        <w:t>AHMED MAHMOUD</w:t>
+        <w:t>Travel and Tourism Operations</w:t>
+      </w:r>
+    </w:p>
+    <w:p>
+      <w:r>
+        <w:t>Destination Management | Service Quality | Process Improvement</w:t>
+      </w:r>
+    </w:p>
+    <w:p>
+      <w:r>
+        <w:t>Netherlands | +31 6 2889 5967 | ahmed.mahmoud.nl.work@gmail.com</w:t>
+      </w:r>
+    </w:p>
+    <w:p>
+      <w:r>
+        <w:t>ahmedqualityops.com | github.com/AhmedElshemyOps | linkedin.com/in/ahmed-mahmoud-tourism/</w:t>
       </w:r>
     </w:p>
     <w:p>
       <w:pPr>
-        <w:spacing w:after="80"/>
+        <w:pStyle w:val="Heading1"/>
       </w:pPr>
       <w:r>
-        <w:rPr>
-          <w:rFonts w:ascii="Arial" w:hAnsi="Arial"/>
-          <w:b/>
-          <w:i w:val="0"/>
-          <w:color w:val="9A6F1B"/>
-          <w:sz w:val="22"/>
-        </w:rPr>
-        <w:t>TOURISM OPERATIONS MANAGER | PRODUCT OPERATIONS MANAGER</w:t>
+        <w:t>Professional Profile</w:t>
+      </w:r>
+    </w:p>
+    <w:p>
+      <w:r>
+        <w:t>13 years in travel, tourism and hospitality across Egypt and the UAE, now based in the Netherlands. Experience spans destination management, multilingual guest services, MICE and FAM support, B2B accommodation operations, transport coordination and travel consulting. Combines practical delivery with Lean Six Sigma, SOP development, tourism product research and operational workflow design.</w:t>
       </w:r>
     </w:p>
     <w:p>
       <w:pPr>
-        <w:spacing w:after="20"/>
-        <w:jc w:val="left"/>
+        <w:pStyle w:val="Heading1"/>
       </w:pPr>
       <w:r>
-        <w:rPr>
-          <w:rFonts w:ascii="Arial" w:hAnsi="Arial"/>
-          <w:b w:val="0"/>
-          <w:i w:val="0"/>
-          <w:color w:val="161F2B"/>
-          <w:sz w:val="18"/>
-        </w:rPr>
-        <w:t xml:space="preserve">Abu Dhabi, UAE  |  a.mahmoud.0412@gmail.com  |  </w:t>
+        <w:t>Core Capabilities</w:t>
       </w:r>
-      <w:hyperlink r:id="rId9">
-        <w:r>
-          <w:rPr>
-            <w:rFonts w:ascii="Arial" w:hAnsi="Arial"/>
-            <w:color w:val="071A32"/>
-            <w:sz w:val="18"/>
-          </w:rPr>
-          <w:t>LinkedIn</w:t>
-        </w:r>
-      </w:hyperlink>
-      <w:r>
-        <w:rPr>
-          <w:rFonts w:ascii="Arial" w:hAnsi="Arial"/>
-          <w:b w:val="0"/>
-          <w:i w:val="0"/>
-          <w:color w:val="161F2B"/>
-          <w:sz w:val="18"/>
-        </w:rPr>
-        <w:t xml:space="preserve">  |  </w:t>
-      </w:r>
-      <w:hyperlink r:id="rId10">
-        <w:r>
-          <w:rPr>
-            <w:rFonts w:ascii="Arial" w:hAnsi="Arial"/>
-            <w:color w:val="071A32"/>
-            <w:sz w:val="18"/>
-          </w:rPr>
-          <w:t>Portfolio</w:t>
-        </w:r>
-      </w:hyperlink>
     </w:p>
     <w:p>
-      <w:pPr>
-        <w:spacing w:after="100"/>
-        <w:pBdr>
-          <w:bottom w:val="single" w:sz="5" w:space="5" w:color="D7C59E"/>
-        </w:pBdr>
-      </w:pPr>
       <w:r>
-        <w:rPr>
-          <w:rFonts w:ascii="Arial" w:hAnsi="Arial"/>
-          <w:b/>
-          <w:i w:val="0"/>
-          <w:color w:val="071A32"/>
-          <w:sz w:val="17"/>
-        </w:rPr>
-        <w:t xml:space="preserve">WORK LOCATION: </w:t>
-      </w:r>
-      <w:r>
-        <w:rPr>
-          <w:rFonts w:ascii="Arial" w:hAnsi="Arial"/>
-          <w:b w:val="0"/>
-          <w:i w:val="0"/>
-          <w:color w:val="161F2B"/>
-          <w:sz w:val="17"/>
-        </w:rPr>
-        <w:t>Available for managerial opportunities across GCC countries and in the Netherlands; Netherlands residence permit holder. Employment remains subject to applicable local requirements.</w:t>
+        <w:t>Destination and DMC operations; guest and supplier coordination; service recovery; MICE support; transport and fleet planning; quotation and commercial workflows; SOPs and handovers; quality and process improvement; product discovery; multilingual content operations.</w:t>
       </w:r>
     </w:p>
     <w:p>
       <w:pPr>
-        <w:spacing w:before="140" w:after="80"/>
-        <w:pBdr>
-          <w:bottom w:val="single" w:sz="6" w:space="3" w:color="9A6F1B"/>
-        </w:pBdr>
-        <w:keepNext/>
-        <w:keepLines/>
+        <w:pStyle w:val="Heading1"/>
       </w:pPr>
       <w:r>
+        <w:t>Professional Experience</w:t>
+      </w:r>
+    </w:p>
+    <w:p>
+      <w:r>
         <w:rPr>
-          <w:rFonts w:ascii="Arial" w:hAnsi="Arial"/>
           <w:b/>
-          <w:i w:val="0"/>
-          <w:color w:val="071A32"/>
-          <w:sz w:val="21"/>
         </w:rPr>
-        <w:t>PROFESSIONAL SUMMARY</w:t>
+        <w:t>Licensed Tour Guide and Cross Functional DMC Operations Support</w:t>
       </w:r>
     </w:p>
     <w:p>
       <w:pPr>
-        <w:spacing w:after="60" w:line="259" w:lineRule="auto"/>
+        <w:spacing w:after="60"/>
       </w:pPr>
       <w:r>
+        <w:t>Masarra DMC - Miral Experiences, Abu Dhabi | Started Dec 2024</w:t>
+      </w:r>
+    </w:p>
+    <w:p>
+      <w:r>
+        <w:t>French and English destination delivery, approximately 350 guests per month and groups up to 45. Contributions included MICE/FAM support, airport-representative procedures, Arabic localisation in Strapi, BOS/Otolo Homes workflows, informal colleague coaching and a Travel Desk improvement project.</w:t>
+      </w:r>
+    </w:p>
+    <w:p>
+      <w:r>
         <w:rPr>
-          <w:rFonts w:ascii="Arial" w:hAnsi="Arial"/>
-          <w:b w:val="0"/>
-          <w:i w:val="0"/>
-          <w:color w:val="161F2B"/>
-          <w:sz w:val="18"/>
+          <w:b/>
         </w:rPr>
-        <w:t>Tourism operations and product-operations professional with 10+ years of experience across destination management, DMC delivery, multilingual guiding, transport coordination, B2B booking support, tour production, supplier communication, service recovery and commercial workflows. Combines field leadership with CAPM®, ITIL® 4 Foundation and Lean Six Sigma Black Belt methods to structure SOPs, handovers, operational controls and practical browser-based planning tools. Prepared for managerial-level roles requiring cross-functional coordination, service quality, product thinking and evidence-led improvement.</w:t>
+        <w:t>Licensed Tour Guide</w:t>
       </w:r>
     </w:p>
     <w:p>
       <w:pPr>
-        <w:spacing w:before="140" w:after="80"/>
-        <w:pBdr>
-          <w:bottom w:val="single" w:sz="6" w:space="3" w:color="9A6F1B"/>
-        </w:pBdr>
-        <w:keepNext/>
-        <w:keepLines/>
+        <w:spacing w:after="60"/>
       </w:pPr>
       <w:r>
+        <w:t>Oceanair Travels, Dubai | Sep 2022 - Nov 2024</w:t>
+      </w:r>
+    </w:p>
+    <w:p>
+      <w:r>
+        <w:t>Delivered multilingual destination experiences for groups up to 35; coordinated guest needs, timing, supplier interfaces and live disruptions.</w:t>
+      </w:r>
+    </w:p>
+    <w:p>
+      <w:r>
         <w:rPr>
-          <w:rFonts w:ascii="Arial" w:hAnsi="Arial"/>
           <w:b/>
-          <w:i w:val="0"/>
-          <w:color w:val="071A32"/>
-          <w:sz w:val="21"/>
         </w:rPr>
-        <w:t>MANAGERIAL VALUE &amp; CORE COMPETENCIES</w:t>
+        <w:t>Operations Executive B2B Accommodation</w:t>
       </w:r>
     </w:p>
     <w:p>
       <w:pPr>
-        <w:spacing w:after="30" w:line="245" w:lineRule="auto"/>
-        <w:numPr>
-          <w:ilvl w:val="0"/>
-          <w:numId w:val="42"/>
-        </w:numPr>
-        <w:keepLines/>
+        <w:spacing w:after="60"/>
       </w:pPr>
       <w:r>
+        <w:t>WebBeds MEA, Cairo | Jun 2022 - Sep 2022</w:t>
+      </w:r>
+    </w:p>
+    <w:p>
+      <w:r>
+        <w:t>Handled an average of approximately 120 daily cases for French-speaking North African markets. Used Juniper and Freshdesk for booking issues, relocations, rates, refunds and partner communication.</w:t>
+      </w:r>
+    </w:p>
+    <w:p>
+      <w:r>
         <w:rPr>
-          <w:rFonts w:ascii="Arial" w:hAnsi="Arial"/>
-          <w:b w:val="0"/>
-          <w:i w:val="0"/>
-          <w:color w:val="161F2B"/>
-          <w:sz w:val="17"/>
+          <w:b/>
         </w:rPr>
-        <w:t>Tourism operations management; destination and DMC operations; daily service delivery; guest journey control</w:t>
+        <w:t>Tour Leader</w:t>
       </w:r>
     </w:p>
     <w:p>
       <w:pPr>
-        <w:spacing w:after="30" w:line="245" w:lineRule="auto"/>
-        <w:numPr>
-          <w:ilvl w:val="0"/>
-          <w:numId w:val="42"/>
-        </w:numPr>
-        <w:keepLines/>
+        <w:spacing w:after="60"/>
       </w:pPr>
       <w:r>
+        <w:t>Fun &amp; Sun / TUI CIS, Sharm El Sheikh | Jul 2021 - Apr 2022</w:t>
+      </w:r>
+    </w:p>
+    <w:p>
+      <w:r>
+        <w:t>Supported excursion sales, transfers and guest services for groups up to 19, coordinating daily arrangements and resolving service issues.</w:t>
+      </w:r>
+    </w:p>
+    <w:p>
+      <w:r>
         <w:rPr>
-          <w:rFonts w:ascii="Arial" w:hAnsi="Arial"/>
-          <w:b w:val="0"/>
-          <w:i w:val="0"/>
-          <w:color w:val="161F2B"/>
-          <w:sz w:val="17"/>
+          <w:b/>
         </w:rPr>
-        <w:t>Team coordination; guide and driver handovers; supplier management; stakeholder communication; issue escalation</w:t>
+        <w:t>Operations Coordinator Transport and Fleet</w:t>
       </w:r>
     </w:p>
     <w:p>
       <w:pPr>
-        <w:spacing w:after="30" w:line="245" w:lineRule="auto"/>
-        <w:numPr>
-          <w:ilvl w:val="0"/>
-          <w:numId w:val="42"/>
-        </w:numPr>
-        <w:keepLines/>
+        <w:spacing w:after="60"/>
       </w:pPr>
       <w:r>
+        <w:t>Alnatalie Red Sea Tours, Cairo | Jan 2020 - Jun 2021</w:t>
+      </w:r>
+    </w:p>
+    <w:p>
+      <w:r>
+        <w:t>Coordinated approximately 15 vehicles, driver allocation, maintenance, insurance and GPS follow-up. Supported transport operations during the 2021 IHF championship.</w:t>
+      </w:r>
+    </w:p>
+    <w:p>
+      <w:r>
         <w:rPr>
-          <w:rFonts w:ascii="Arial" w:hAnsi="Arial"/>
-          <w:b w:val="0"/>
-          <w:i w:val="0"/>
-          <w:color w:val="161F2B"/>
-          <w:sz w:val="17"/>
+          <w:b/>
         </w:rPr>
-        <w:t>Transport dispatch; airport transfers; multi-stop routing; hotel pickups; ticketing; manifests; operational briefs</w:t>
+        <w:t>Travel and Tourism Consultant</w:t>
       </w:r>
     </w:p>
     <w:p>
       <w:pPr>
-        <w:spacing w:after="30" w:line="245" w:lineRule="auto"/>
-        <w:numPr>
-          <w:ilvl w:val="0"/>
-          <w:numId w:val="42"/>
-        </w:numPr>
-        <w:keepLines/>
+        <w:spacing w:after="60"/>
       </w:pPr>
       <w:r>
-        <w:rPr>
-          <w:rFonts w:ascii="Arial" w:hAnsi="Arial"/>
-          <w:b w:val="0"/>
-          <w:i w:val="0"/>
-          <w:color w:val="161F2B"/>
-          <w:sz w:val="17"/>
-        </w:rPr>
-        <w:t>Tourism product development; itinerary design; operational feasibility; MICE operations; quotation and margin logic</w:t>
+        <w:t>Elmadina Tours, Cairo | Jan 2013 - Jan 2020</w:t>
       </w:r>
     </w:p>
     <w:p>
-      <w:pPr>
-        <w:spacing w:after="30" w:line="245" w:lineRule="auto"/>
-        <w:numPr>
-          <w:ilvl w:val="0"/>
-          <w:numId w:val="42"/>
-        </w:numPr>
-        <w:keepLines/>
-      </w:pPr>
       <w:r>
-        <w:rPr>
-          <w:rFonts w:ascii="Arial" w:hAnsi="Arial"/>
-          <w:b w:val="0"/>
-          <w:i w:val="0"/>
-          <w:color w:val="161F2B"/>
-          <w:sz w:val="17"/>
-        </w:rPr>
-        <w:t>SOP development; process mapping; service quality; risk assessment; continual improvement; Lean Six Sigma</w:t>
-      </w:r>
-    </w:p>
-    <w:p>
-      <w:pPr>
-        <w:spacing w:after="30" w:line="245" w:lineRule="auto"/>
-        <w:numPr>
-          <w:ilvl w:val="0"/>
-          <w:numId w:val="42"/>
-        </w:numPr>
-        <w:keepLines/>
-      </w:pPr>
-      <w:r>
-        <w:rPr>
-          <w:rFonts w:ascii="Arial" w:hAnsi="Arial"/>
-          <w:b w:val="0"/>
-          <w:i w:val="0"/>
-          <w:color w:val="161F2B"/>
-          <w:sz w:val="17"/>
-        </w:rPr>
-        <w:t>Product operations; requirements definition; workflow design; static MVP development; responsible AI implementation</w:t>
-      </w:r>
-    </w:p>
-    <w:p>
-      <w:pPr>
-        <w:spacing w:before="140" w:after="80"/>
-        <w:pBdr>
-          <w:bottom w:val="single" w:sz="6" w:space="3" w:color="9A6F1B"/>
-        </w:pBdr>
-        <w:keepNext/>
-        <w:keepLines/>
-      </w:pPr>
-      <w:r>
-        <w:rPr>
-          <w:rFonts w:ascii="Arial" w:hAnsi="Arial"/>
-          <w:b/>
-          <w:i w:val="0"/>
-          <w:color w:val="071A32"/>
-          <w:sz w:val="21"/>
-        </w:rPr>
-        <w:t>PROFESSIONAL EXPERIENCE</w:t>
-      </w:r>
-    </w:p>
-    <w:p>
-      <w:pPr>
-        <w:spacing w:before="70" w:after="0"/>
-        <w:keepNext/>
-        <w:keepLines/>
-      </w:pPr>
-      <w:r>
-        <w:rPr>
-          <w:rFonts w:ascii="Arial" w:hAnsi="Arial"/>
-          <w:b/>
-          <w:i w:val="0"/>
-          <w:color w:val="071A32"/>
-          <w:sz w:val="19"/>
-        </w:rPr>
-        <w:t>Licensed Tour Guide (French &amp; English) / Operations Support</w:t>
-      </w:r>
-      <w:r>
-        <w:rPr>
-          <w:rFonts w:ascii="Arial" w:hAnsi="Arial"/>
-          <w:b/>
-          <w:i w:val="0"/>
-          <w:color w:val="9A6F1B"/>
-          <w:sz w:val="17"/>
-        </w:rPr>
-        <w:t xml:space="preserve">  |  Dec 2024 – Present</w:t>
-      </w:r>
-    </w:p>
-    <w:p>
-      <w:pPr>
-        <w:spacing w:after="30"/>
-        <w:keepNext/>
-        <w:keepLines/>
-      </w:pPr>
-      <w:r>
-        <w:rPr>
-          <w:rFonts w:ascii="Arial" w:hAnsi="Arial"/>
-          <w:b/>
-          <w:i w:val="0"/>
-          <w:color w:val="4F5B6C"/>
-          <w:sz w:val="17"/>
-        </w:rPr>
-        <w:t>Masarra DMC – Miral Experiences  |  Abu Dhabi, UAE</w:t>
-      </w:r>
-    </w:p>
-    <w:p>
-      <w:pPr>
-        <w:spacing w:after="30" w:line="245" w:lineRule="auto"/>
-        <w:numPr>
-          <w:ilvl w:val="0"/>
-          <w:numId w:val="42"/>
-        </w:numPr>
-        <w:keepLines/>
-      </w:pPr>
-      <w:r>
-        <w:rPr>
-          <w:rFonts w:ascii="Arial" w:hAnsi="Arial"/>
-          <w:b w:val="0"/>
-          <w:i w:val="0"/>
-          <w:color w:val="161F2B"/>
-          <w:sz w:val="17"/>
-        </w:rPr>
-        <w:t>Coordinate bilingual guest delivery, transport, ticketing, supplier handovers and live operational changes across active service windows.</w:t>
-      </w:r>
-    </w:p>
-    <w:p>
-      <w:pPr>
-        <w:spacing w:after="30" w:line="245" w:lineRule="auto"/>
-        <w:numPr>
-          <w:ilvl w:val="0"/>
-          <w:numId w:val="42"/>
-        </w:numPr>
-        <w:keepLines/>
-      </w:pPr>
-      <w:r>
-        <w:rPr>
-          <w:rFonts w:ascii="Arial" w:hAnsi="Arial"/>
-          <w:b w:val="0"/>
-          <w:i w:val="0"/>
-          <w:color w:val="161F2B"/>
-          <w:sz w:val="17"/>
-        </w:rPr>
-        <w:t>Support destination operations by converting programme requirements into clear field instructions, escalation points and service-recovery actions.</w:t>
-      </w:r>
-    </w:p>
-    <w:p>
-      <w:pPr>
-        <w:spacing w:after="30" w:line="245" w:lineRule="auto"/>
-        <w:numPr>
-          <w:ilvl w:val="0"/>
-          <w:numId w:val="42"/>
-        </w:numPr>
-        <w:keepLines/>
-      </w:pPr>
-      <w:r>
-        <w:rPr>
-          <w:rFonts w:ascii="Arial" w:hAnsi="Arial"/>
-          <w:b w:val="0"/>
-          <w:i w:val="0"/>
-          <w:color w:val="161F2B"/>
-          <w:sz w:val="17"/>
-        </w:rPr>
-        <w:t>Apply current UAE destination knowledge and five tour-guide licences across Abu Dhabi, Dubai, Sharjah, Ras Al Khaimah and Louvre Abu Dhabi contexts.</w:t>
-      </w:r>
-    </w:p>
-    <w:p>
-      <w:pPr>
-        <w:spacing w:before="70" w:after="0"/>
-        <w:keepNext/>
-        <w:keepLines/>
-      </w:pPr>
-      <w:r>
-        <w:rPr>
-          <w:rFonts w:ascii="Arial" w:hAnsi="Arial"/>
-          <w:b/>
-          <w:i w:val="0"/>
-          <w:color w:val="071A32"/>
-          <w:sz w:val="19"/>
-        </w:rPr>
-        <w:t>Licensed Tour Guide (French &amp; English)</w:t>
-      </w:r>
-      <w:r>
-        <w:rPr>
-          <w:rFonts w:ascii="Arial" w:hAnsi="Arial"/>
-          <w:b/>
-          <w:i w:val="0"/>
-          <w:color w:val="9A6F1B"/>
-          <w:sz w:val="17"/>
-        </w:rPr>
-        <w:t xml:space="preserve">  |  Sep 2022 – Nov 2024</w:t>
-      </w:r>
-    </w:p>
-    <w:p>
-      <w:pPr>
-        <w:spacing w:after="30"/>
-        <w:keepNext/>
-        <w:keepLines/>
-      </w:pPr>
-      <w:r>
-        <w:rPr>
-          <w:rFonts w:ascii="Arial" w:hAnsi="Arial"/>
-          <w:b/>
-          <w:i w:val="0"/>
-          <w:color w:val="4F5B6C"/>
-          <w:sz w:val="17"/>
-        </w:rPr>
-        <w:t>Oceanair Travels  |  Dubai, UAE</w:t>
-      </w:r>
-    </w:p>
-    <w:p>
-      <w:pPr>
-        <w:spacing w:after="30" w:line="245" w:lineRule="auto"/>
-        <w:numPr>
-          <w:ilvl w:val="0"/>
-          <w:numId w:val="42"/>
-        </w:numPr>
-        <w:keepLines/>
-      </w:pPr>
-      <w:r>
-        <w:rPr>
-          <w:rFonts w:ascii="Arial" w:hAnsi="Arial"/>
-          <w:b w:val="0"/>
-          <w:i w:val="0"/>
-          <w:color w:val="161F2B"/>
-          <w:sz w:val="17"/>
-        </w:rPr>
-        <w:t>Delivered multilingual destination programmes while coordinating timing, guest flow, suppliers and operational handovers.</w:t>
-      </w:r>
-    </w:p>
-    <w:p>
-      <w:pPr>
-        <w:spacing w:after="30" w:line="245" w:lineRule="auto"/>
-        <w:numPr>
-          <w:ilvl w:val="0"/>
-          <w:numId w:val="42"/>
-        </w:numPr>
-        <w:keepLines/>
-      </w:pPr>
-      <w:r>
-        <w:rPr>
-          <w:rFonts w:ascii="Arial" w:hAnsi="Arial"/>
-          <w:b w:val="0"/>
-          <w:i w:val="0"/>
-          <w:color w:val="161F2B"/>
-          <w:sz w:val="17"/>
-        </w:rPr>
-        <w:t>Resolved real-time service issues and protected itinerary continuity for international groups through clear guest and team communication.</w:t>
-      </w:r>
-    </w:p>
-    <w:p>
-      <w:pPr>
-        <w:spacing w:before="70" w:after="0"/>
-        <w:keepNext/>
-        <w:keepLines/>
-      </w:pPr>
-      <w:r>
-        <w:rPr>
-          <w:rFonts w:ascii="Arial" w:hAnsi="Arial"/>
-          <w:b/>
-          <w:i w:val="0"/>
-          <w:color w:val="071A32"/>
-          <w:sz w:val="19"/>
-        </w:rPr>
-        <w:t>Operations Executive</w:t>
-      </w:r>
-      <w:r>
-        <w:rPr>
-          <w:rFonts w:ascii="Arial" w:hAnsi="Arial"/>
-          <w:b/>
-          <w:i w:val="0"/>
-          <w:color w:val="9A6F1B"/>
-          <w:sz w:val="17"/>
-        </w:rPr>
-        <w:t xml:space="preserve">  |  Jun 2022 – Sep 2022</w:t>
-      </w:r>
-    </w:p>
-    <w:p>
-      <w:pPr>
-        <w:spacing w:after="30"/>
-        <w:keepNext/>
-        <w:keepLines/>
-      </w:pPr>
-      <w:r>
-        <w:rPr>
-          <w:rFonts w:ascii="Arial" w:hAnsi="Arial"/>
-          <w:b/>
-          <w:i w:val="0"/>
-          <w:color w:val="4F5B6C"/>
-          <w:sz w:val="17"/>
-        </w:rPr>
-        <w:t>WebBeds Middle East &amp; Africa  |  Cairo, Egypt</w:t>
-      </w:r>
-    </w:p>
-    <w:p>
-      <w:pPr>
-        <w:spacing w:after="30" w:line="245" w:lineRule="auto"/>
-        <w:numPr>
-          <w:ilvl w:val="0"/>
-          <w:numId w:val="42"/>
-        </w:numPr>
-        <w:keepLines/>
-      </w:pPr>
-      <w:r>
-        <w:rPr>
-          <w:rFonts w:ascii="Arial" w:hAnsi="Arial"/>
-          <w:b w:val="0"/>
-          <w:i w:val="0"/>
-          <w:color w:val="161F2B"/>
-          <w:sz w:val="17"/>
-        </w:rPr>
-        <w:t>Resolved B2B booking discrepancies, relocations, amendments and refunds using Juniper and Freshdesk.</w:t>
-      </w:r>
-    </w:p>
-    <w:p>
-      <w:pPr>
-        <w:spacing w:after="30" w:line="245" w:lineRule="auto"/>
-        <w:numPr>
-          <w:ilvl w:val="0"/>
-          <w:numId w:val="42"/>
-        </w:numPr>
-        <w:keepLines/>
-      </w:pPr>
-      <w:r>
-        <w:rPr>
-          <w:rFonts w:ascii="Arial" w:hAnsi="Arial"/>
-          <w:b w:val="0"/>
-          <w:i w:val="0"/>
-          <w:color w:val="161F2B"/>
-          <w:sz w:val="17"/>
-        </w:rPr>
-        <w:t>Coordinated with internal teams and accommodation partners to restore service and document case outcomes.</w:t>
-      </w:r>
-    </w:p>
-    <w:p>
-      <w:pPr>
-        <w:spacing w:before="70" w:after="0"/>
-        <w:keepNext/>
-        <w:keepLines/>
-      </w:pPr>
-      <w:r>
-        <w:rPr>
-          <w:rFonts w:ascii="Arial" w:hAnsi="Arial"/>
-          <w:b/>
-          <w:i w:val="0"/>
-          <w:color w:val="071A32"/>
-          <w:sz w:val="19"/>
-        </w:rPr>
-        <w:t>Tour Leader</w:t>
-      </w:r>
-      <w:r>
-        <w:rPr>
-          <w:rFonts w:ascii="Arial" w:hAnsi="Arial"/>
-          <w:b/>
-          <w:i w:val="0"/>
-          <w:color w:val="9A6F1B"/>
-          <w:sz w:val="17"/>
-        </w:rPr>
-        <w:t xml:space="preserve">  |  Jul 2021 – Apr 2022</w:t>
-      </w:r>
-    </w:p>
-    <w:p>
-      <w:pPr>
-        <w:spacing w:after="30"/>
-        <w:keepNext/>
-        <w:keepLines/>
-      </w:pPr>
-      <w:r>
-        <w:rPr>
-          <w:rFonts w:ascii="Arial" w:hAnsi="Arial"/>
-          <w:b/>
-          <w:i w:val="0"/>
-          <w:color w:val="4F5B6C"/>
-          <w:sz w:val="17"/>
-        </w:rPr>
-        <w:t>Fun &amp; Sun / TUI CIS  |  Sharm El Sheikh, Egypt</w:t>
-      </w:r>
-    </w:p>
-    <w:p>
-      <w:pPr>
-        <w:spacing w:after="30" w:line="245" w:lineRule="auto"/>
-        <w:numPr>
-          <w:ilvl w:val="0"/>
-          <w:numId w:val="42"/>
-        </w:numPr>
-        <w:keepLines/>
-      </w:pPr>
-      <w:r>
-        <w:rPr>
-          <w:rFonts w:ascii="Arial" w:hAnsi="Arial"/>
-          <w:b w:val="0"/>
-          <w:i w:val="0"/>
-          <w:color w:val="161F2B"/>
-          <w:sz w:val="17"/>
-        </w:rPr>
-        <w:t>Safeguarded service continuity across airport transfers, excursions and multinational tour movements.</w:t>
-      </w:r>
-    </w:p>
-    <w:p>
-      <w:pPr>
-        <w:spacing w:after="30" w:line="245" w:lineRule="auto"/>
-        <w:numPr>
-          <w:ilvl w:val="0"/>
-          <w:numId w:val="42"/>
-        </w:numPr>
-        <w:keepLines/>
-      </w:pPr>
-      <w:r>
-        <w:rPr>
-          <w:rFonts w:ascii="Arial" w:hAnsi="Arial"/>
-          <w:b w:val="0"/>
-          <w:i w:val="0"/>
-          <w:color w:val="161F2B"/>
-          <w:sz w:val="17"/>
-        </w:rPr>
-        <w:t>Coordinated guests, transport teams and suppliers while managing schedule changes and operational exceptions.</w:t>
-      </w:r>
-    </w:p>
-    <w:p>
-      <w:pPr>
-        <w:spacing w:before="70" w:after="0"/>
-        <w:keepNext/>
-        <w:keepLines/>
-      </w:pPr>
-      <w:r>
-        <w:rPr>
-          <w:rFonts w:ascii="Arial" w:hAnsi="Arial"/>
-          <w:b/>
-          <w:i w:val="0"/>
-          <w:color w:val="071A32"/>
-          <w:sz w:val="19"/>
-        </w:rPr>
-        <w:t>Operations Coordinator</w:t>
-      </w:r>
-      <w:r>
-        <w:rPr>
-          <w:rFonts w:ascii="Arial" w:hAnsi="Arial"/>
-          <w:b/>
-          <w:i w:val="0"/>
-          <w:color w:val="9A6F1B"/>
-          <w:sz w:val="17"/>
-        </w:rPr>
-        <w:t xml:space="preserve">  |  Jan 2020 – Jun 2021</w:t>
-      </w:r>
-    </w:p>
-    <w:p>
-      <w:pPr>
-        <w:spacing w:after="30"/>
-        <w:keepNext/>
-        <w:keepLines/>
-      </w:pPr>
-      <w:r>
-        <w:rPr>
-          <w:rFonts w:ascii="Arial" w:hAnsi="Arial"/>
-          <w:b/>
-          <w:i w:val="0"/>
-          <w:color w:val="4F5B6C"/>
-          <w:sz w:val="17"/>
-        </w:rPr>
-        <w:t>Al Natalie Red Sea Tours  |  Cairo, Egypt</w:t>
-      </w:r>
-    </w:p>
-    <w:p>
-      <w:pPr>
-        <w:spacing w:after="30" w:line="245" w:lineRule="auto"/>
-        <w:numPr>
-          <w:ilvl w:val="0"/>
-          <w:numId w:val="42"/>
-        </w:numPr>
-        <w:keepLines/>
-      </w:pPr>
-      <w:r>
-        <w:rPr>
-          <w:rFonts w:ascii="Arial" w:hAnsi="Arial"/>
-          <w:b w:val="0"/>
-          <w:i w:val="0"/>
-          <w:color w:val="161F2B"/>
-          <w:sz w:val="17"/>
-        </w:rPr>
-        <w:t>Coordinated fleet allocation and service schedules through high-demand tourism and event periods.</w:t>
-      </w:r>
-    </w:p>
-    <w:p>
-      <w:pPr>
-        <w:spacing w:after="30" w:line="245" w:lineRule="auto"/>
-        <w:numPr>
-          <w:ilvl w:val="0"/>
-          <w:numId w:val="42"/>
-        </w:numPr>
-        <w:keepLines/>
-      </w:pPr>
-      <w:r>
-        <w:rPr>
-          <w:rFonts w:ascii="Arial" w:hAnsi="Arial"/>
-          <w:b w:val="0"/>
-          <w:i w:val="0"/>
-          <w:color w:val="161F2B"/>
-          <w:sz w:val="17"/>
-        </w:rPr>
-        <w:t>Supported operational handovers between drivers, guides, suppliers and internal teams.</w:t>
+        <w:t>Arranged leisure and honeymoon packages, flights, visas, suppliers and quotations; supported Hajj and Umrah group travel. Worked with SAFA and Amadeus.</w:t>
       </w:r>
     </w:p>
     <w:p>
@@ -748,492 +201,145 @@
     </w:p>
     <w:p>
       <w:pPr>
-        <w:spacing w:before="140" w:after="80"/>
-        <w:pBdr>
-          <w:bottom w:val="single" w:sz="6" w:space="3" w:color="9A6F1B"/>
-        </w:pBdr>
-        <w:keepNext/>
-        <w:keepLines/>
+        <w:pStyle w:val="Heading1"/>
       </w:pPr>
       <w:r>
-        <w:rPr>
-          <w:rFonts w:ascii="Arial" w:hAnsi="Arial"/>
-          <w:b/>
-          <w:i w:val="0"/>
-          <w:color w:val="071A32"/>
-          <w:sz w:val="21"/>
-        </w:rPr>
-        <w:t>PROFESSIONAL EXPERIENCE — CONTINUED</w:t>
+        <w:t>Selected Projects and Contributions</w:t>
       </w:r>
     </w:p>
     <w:p>
       <w:pPr>
-        <w:spacing w:before="70" w:after="0"/>
-        <w:keepNext/>
-        <w:keepLines/>
+        <w:pStyle w:val="Heading2"/>
       </w:pPr>
       <w:r>
-        <w:rPr>
-          <w:rFonts w:ascii="Arial" w:hAnsi="Arial"/>
-          <w:b/>
-          <w:i w:val="0"/>
-          <w:color w:val="071A32"/>
-          <w:sz w:val="19"/>
-        </w:rPr>
-        <w:t>Tourism &amp; Travel Consultant</w:t>
+        <w:t>Travel Desk improvement</w:t>
       </w:r>
+    </w:p>
+    <w:p>
       <w:r>
-        <w:rPr>
-          <w:rFonts w:ascii="Arial" w:hAnsi="Arial"/>
-          <w:b/>
-          <w:i w:val="0"/>
-          <w:color w:val="9A6F1B"/>
-          <w:sz w:val="17"/>
-        </w:rPr>
-        <w:t xml:space="preserve">  |  Jan 2013 – Jan 2020</w:t>
+        <w:t>2025 Lean Six Sigma Black Belt DMAIC project on strategic agent allocation. Applied statistical and cause analysis to allocation, training, multilingual materials, offers and control planning. Baseline median monthly agent sales: AED 8,059; target: AED 12,500. The AED 746,088 annual opportunity across 14 agents is projected and conditional on target achievement, not recorded realised revenue.</w:t>
       </w:r>
     </w:p>
     <w:p>
       <w:pPr>
-        <w:spacing w:after="30"/>
-        <w:keepNext/>
-        <w:keepLines/>
+        <w:pStyle w:val="Heading2"/>
       </w:pPr>
       <w:r>
-        <w:rPr>
-          <w:rFonts w:ascii="Arial" w:hAnsi="Arial"/>
-          <w:b/>
-          <w:i w:val="0"/>
-          <w:color w:val="4F5B6C"/>
-          <w:sz w:val="17"/>
-        </w:rPr>
-        <w:t>Elmadina Tours  |  Cairo, Egypt</w:t>
+        <w:t>Amsterdam tourism product discovery</w:t>
+      </w:r>
+    </w:p>
+    <w:p>
+      <w:r>
+        <w:t>12-part research case study connecting customer evidence, requirements, feasibility, economics and pilot controls. Pre-pilot research with an iterate decision; real departures and post-pilot outcomes are not established.</w:t>
       </w:r>
     </w:p>
     <w:p>
       <w:pPr>
-        <w:spacing w:after="30" w:line="245" w:lineRule="auto"/>
-        <w:numPr>
-          <w:ilvl w:val="0"/>
-          <w:numId w:val="42"/>
-        </w:numPr>
-        <w:keepLines/>
+        <w:pStyle w:val="Heading2"/>
       </w:pPr>
       <w:r>
-        <w:rPr>
-          <w:rFonts w:ascii="Arial" w:hAnsi="Arial"/>
-          <w:b w:val="0"/>
-          <w:i w:val="0"/>
-          <w:color w:val="161F2B"/>
-          <w:sz w:val="17"/>
-        </w:rPr>
-        <w:t>Managed customer journeys from package design and visa support through supplier coordination and post-travel care.</w:t>
+        <w:t>Operational workflow demonstrations</w:t>
+      </w:r>
+    </w:p>
+    <w:p>
+      <w:r>
+        <w:t>InfraQuote: commercial quotation and margin controls. InfraDispatch: assignment review and field handovers. InfraSky: condition-aware experience readiness. InfraCluster: pickup grouping and capacity checks. Static browser demonstrations; no production integrations are claimed.</w:t>
       </w:r>
     </w:p>
     <w:p>
       <w:pPr>
-        <w:spacing w:after="30" w:line="245" w:lineRule="auto"/>
-        <w:numPr>
-          <w:ilvl w:val="0"/>
-          <w:numId w:val="42"/>
-        </w:numPr>
-        <w:keepLines/>
+        <w:pStyle w:val="Heading1"/>
       </w:pPr>
       <w:r>
-        <w:rPr>
-          <w:rFonts w:ascii="Arial" w:hAnsi="Arial"/>
-          <w:b w:val="0"/>
-          <w:i w:val="0"/>
-          <w:color w:val="161F2B"/>
-          <w:sz w:val="17"/>
-        </w:rPr>
-        <w:t>Prepared itineraries, supported sales and maintained customer and supplier communication across the booking lifecycle.</w:t>
+        <w:t>Professional Certifications</w:t>
+      </w:r>
+    </w:p>
+    <w:p>
+      <w:r>
+        <w:t>CAPM - Project Management Institute | Jun 2025 - Jun 2028</w:t>
+        <w:br/>
+        <w:t>Lean Six Sigma Black Belt - Anexas / Miral | Jul 2025</w:t>
+        <w:br/>
+        <w:t>ITIL 4 Foundation - PeopleCert / AXELOS | Aug 2024 - Aug 2027</w:t>
+        <w:br/>
+        <w:t>Professional Certified Marketer - American Marketing Association | Jul 2025 - Jul 2028</w:t>
+        <w:br/>
+        <w:t>CompTIA IT Fundamentals | Jun 2024</w:t>
+        <w:br/>
+        <w:t>First Time Leading Others | Feb 2025</w:t>
       </w:r>
     </w:p>
     <w:p>
       <w:pPr>
-        <w:spacing w:before="140" w:after="80"/>
-        <w:pBdr>
-          <w:bottom w:val="single" w:sz="6" w:space="3" w:color="9A6F1B"/>
-        </w:pBdr>
-        <w:keepNext/>
-        <w:keepLines/>
+        <w:pStyle w:val="Heading1"/>
       </w:pPr>
       <w:r>
-        <w:rPr>
-          <w:rFonts w:ascii="Arial" w:hAnsi="Arial"/>
-          <w:b/>
-          <w:i w:val="0"/>
-          <w:color w:val="071A32"/>
-          <w:sz w:val="21"/>
-        </w:rPr>
-        <w:t>SELECTED PRODUCT &amp; OPERATIONS PROJECTS</w:t>
+        <w:t>IATA Diplomas and Travel Training</w:t>
+      </w:r>
+    </w:p>
+    <w:p>
+      <w:r>
+        <w:t>Travel Operations Management Diploma | Mar 2026</w:t>
+        <w:br/>
+        <w:t>MICE &amp; Sales Diploma | Jul 2025</w:t>
+        <w:br/>
+        <w:t>Special Cargo Handling Diploma | Jan 2025</w:t>
+        <w:br/>
+        <w:t>Tour Production Diploma | Sep 2024</w:t>
+        <w:br/>
+        <w:t>Travel &amp; Tourism Consultant Diploma | May 2021</w:t>
+        <w:br/>
+        <w:t>Additional IATA training: Transport of Pharma Products &amp; Vaccines by Air | May 2024</w:t>
       </w:r>
     </w:p>
     <w:p>
       <w:pPr>
-        <w:spacing w:after="30" w:line="245" w:lineRule="auto"/>
-        <w:numPr>
-          <w:ilvl w:val="0"/>
-          <w:numId w:val="42"/>
-        </w:numPr>
-        <w:keepLines/>
+        <w:pStyle w:val="Heading1"/>
       </w:pPr>
       <w:r>
-        <w:rPr>
-          <w:rFonts w:ascii="Arial" w:hAnsi="Arial"/>
-          <w:b w:val="0"/>
-          <w:i w:val="0"/>
-          <w:color w:val="161F2B"/>
-          <w:sz w:val="17"/>
-        </w:rPr>
-        <w:t>InfraDispatch — Flagship smart rule-based dispatch planner/demo for trip inputs, pickup points, team and vehicle assignments, costs, approvals and operational handoff.</w:t>
+        <w:t>Education</w:t>
+      </w:r>
+    </w:p>
+    <w:p>
+      <w:r>
+        <w:t>Cairo University - Faculty of Law | Licence / Bachelor of Law | 2006 - 2010</w:t>
       </w:r>
     </w:p>
     <w:p>
       <w:pPr>
-        <w:spacing w:after="30" w:line="245" w:lineRule="auto"/>
-        <w:numPr>
-          <w:ilvl w:val="0"/>
-          <w:numId w:val="42"/>
-        </w:numPr>
-        <w:keepLines/>
+        <w:pStyle w:val="Heading1"/>
       </w:pPr>
       <w:r>
-        <w:rPr>
-          <w:rFonts w:ascii="Arial" w:hAnsi="Arial"/>
-          <w:b w:val="0"/>
-          <w:i w:val="0"/>
-          <w:color w:val="161F2B"/>
-          <w:sz w:val="17"/>
-        </w:rPr>
-        <w:t>InfraCluster — Static pickup-clustering workflow for operating constraints, timing pressure, capacity review and dispatch handoff.</w:t>
+        <w:t>Languages and Systems</w:t>
+      </w:r>
+    </w:p>
+    <w:p>
+      <w:r>
+        <w:t>Arabic: native. English: advanced professional. French: professional, DELF B1 and 450 hours of study. Russian: working knowledge, 250 hours of study. Dutch: A1, studying.</w:t>
+      </w:r>
+    </w:p>
+    <w:p>
+      <w:r>
+        <w:t>BOS, Otolo Homes, Juniper, Freshdesk, Sriggle, SAFA, Amadeus, Strapi, Excel, Microsoft Office, Google Workspace, GitHub and HTML/JavaScript workflows.</w:t>
       </w:r>
     </w:p>
     <w:p>
       <w:pPr>
-        <w:spacing w:after="30" w:line="245" w:lineRule="auto"/>
-        <w:numPr>
-          <w:ilvl w:val="0"/>
-          <w:numId w:val="42"/>
-        </w:numPr>
-        <w:keepLines/>
+        <w:pStyle w:val="Heading1"/>
       </w:pPr>
       <w:r>
-        <w:rPr>
-          <w:rFonts w:ascii="Arial" w:hAnsi="Arial"/>
-          <w:b w:val="0"/>
-          <w:i w:val="0"/>
-          <w:color w:val="161F2B"/>
-          <w:sz w:val="17"/>
-        </w:rPr>
-        <w:t>InfraSky — Static experience-readiness planner connecting supplied sky and field conditions with responsible product and operating decisions.</w:t>
+        <w:t>Licences and Field Readiness</w:t>
       </w:r>
     </w:p>
     <w:p>
-      <w:pPr>
-        <w:spacing w:after="30" w:line="245" w:lineRule="auto"/>
-        <w:numPr>
-          <w:ilvl w:val="0"/>
-          <w:numId w:val="42"/>
-        </w:numPr>
-        <w:keepLines/>
-      </w:pPr>
       <w:r>
-        <w:rPr>
-          <w:rFonts w:ascii="Arial" w:hAnsi="Arial"/>
-          <w:b w:val="0"/>
-          <w:i w:val="0"/>
-          <w:color w:val="161F2B"/>
-          <w:sz w:val="17"/>
-        </w:rPr>
-        <w:t>InfraQuote — Static commercial workflow for costing, break-even logic, margin review and client-ready quotation output.</w:t>
-      </w:r>
-    </w:p>
-    <w:p>
-      <w:pPr>
-        <w:spacing w:after="30" w:line="245" w:lineRule="auto"/>
-        <w:numPr>
-          <w:ilvl w:val="0"/>
-          <w:numId w:val="42"/>
-        </w:numPr>
-        <w:keepLines/>
-      </w:pPr>
-      <w:r>
-        <w:rPr>
-          <w:rFonts w:ascii="Arial" w:hAnsi="Arial"/>
-          <w:b w:val="0"/>
-          <w:i w:val="0"/>
-          <w:color w:val="161F2B"/>
-          <w:sz w:val="17"/>
-        </w:rPr>
-        <w:t>Published Knowledge Platform — original articles covering tourism operations, AI implementation, quality, commercial practice, MICE and product discovery.</w:t>
-      </w:r>
-    </w:p>
-    <w:p>
-      <w:pPr>
-        <w:spacing w:before="140" w:after="80"/>
-        <w:pBdr>
-          <w:bottom w:val="single" w:sz="6" w:space="3" w:color="9A6F1B"/>
-        </w:pBdr>
-        <w:keepNext/>
-        <w:keepLines/>
-      </w:pPr>
-      <w:r>
-        <w:rPr>
-          <w:rFonts w:ascii="Arial" w:hAnsi="Arial"/>
-          <w:b/>
-          <w:i w:val="0"/>
-          <w:color w:val="071A32"/>
-          <w:sz w:val="21"/>
-        </w:rPr>
-        <w:t>PROFESSIONAL CERTIFICATIONS &amp; DIPLOMAS</w:t>
-      </w:r>
-    </w:p>
-    <w:p>
-      <w:pPr>
-        <w:spacing w:after="30" w:line="245" w:lineRule="auto"/>
-        <w:numPr>
-          <w:ilvl w:val="0"/>
-          <w:numId w:val="42"/>
-        </w:numPr>
-        <w:keepLines/>
-      </w:pPr>
-      <w:r>
-        <w:rPr>
-          <w:rFonts w:ascii="Arial" w:hAnsi="Arial"/>
-          <w:b w:val="0"/>
-          <w:i w:val="0"/>
-          <w:color w:val="161F2B"/>
-          <w:sz w:val="17"/>
-        </w:rPr>
-        <w:t>Lean Six Sigma Black Belt — Anexas Europe / Miral LLC, 2025</w:t>
-      </w:r>
-    </w:p>
-    <w:p>
-      <w:pPr>
-        <w:spacing w:after="30" w:line="245" w:lineRule="auto"/>
-        <w:numPr>
-          <w:ilvl w:val="0"/>
-          <w:numId w:val="42"/>
-        </w:numPr>
-        <w:keepLines/>
-      </w:pPr>
-      <w:r>
-        <w:rPr>
-          <w:rFonts w:ascii="Arial" w:hAnsi="Arial"/>
-          <w:b w:val="0"/>
-          <w:i w:val="0"/>
-          <w:color w:val="161F2B"/>
-          <w:sz w:val="17"/>
-        </w:rPr>
-        <w:t>ITIL® 4 Foundation — PeopleCert / AXELOS, 2024; renewable 2027</w:t>
-      </w:r>
-    </w:p>
-    <w:p>
-      <w:pPr>
-        <w:spacing w:after="30" w:line="245" w:lineRule="auto"/>
-        <w:numPr>
-          <w:ilvl w:val="0"/>
-          <w:numId w:val="42"/>
-        </w:numPr>
-        <w:keepLines/>
-      </w:pPr>
-      <w:r>
-        <w:rPr>
-          <w:rFonts w:ascii="Arial" w:hAnsi="Arial"/>
-          <w:b w:val="0"/>
-          <w:i w:val="0"/>
-          <w:color w:val="161F2B"/>
-          <w:sz w:val="17"/>
-        </w:rPr>
-        <w:t>Certified Associate in Project Management (CAPM®) — Project Management Institute, 2024; expires 2027</w:t>
-      </w:r>
-    </w:p>
-    <w:p>
-      <w:pPr>
-        <w:spacing w:after="30" w:line="245" w:lineRule="auto"/>
-        <w:numPr>
-          <w:ilvl w:val="0"/>
-          <w:numId w:val="42"/>
-        </w:numPr>
-        <w:keepLines/>
-      </w:pPr>
-      <w:r>
-        <w:rPr>
-          <w:rFonts w:ascii="Arial" w:hAnsi="Arial"/>
-          <w:b w:val="0"/>
-          <w:i w:val="0"/>
-          <w:color w:val="161F2B"/>
-          <w:sz w:val="17"/>
-        </w:rPr>
-        <w:t>IATA Diplomas — Travel Operations; MICE and Sales; Tour Production; Travel and Tourism Consultant; Special Cargo Handling</w:t>
-      </w:r>
-    </w:p>
-    <w:p>
-      <w:pPr>
-        <w:spacing w:after="30" w:line="245" w:lineRule="auto"/>
-        <w:numPr>
-          <w:ilvl w:val="0"/>
-          <w:numId w:val="42"/>
-        </w:numPr>
-        <w:keepLines/>
-      </w:pPr>
-      <w:r>
-        <w:rPr>
-          <w:rFonts w:ascii="Arial" w:hAnsi="Arial"/>
-          <w:b w:val="0"/>
-          <w:i w:val="0"/>
-          <w:color w:val="161F2B"/>
-          <w:sz w:val="17"/>
-        </w:rPr>
-        <w:t>Egyptian Travel Agents Association (ETAA) — Tour Operator, Sales Skills and Religious-Tour Leadership training</w:t>
-      </w:r>
-    </w:p>
-    <w:p>
-      <w:pPr>
-        <w:spacing w:after="30" w:line="245" w:lineRule="auto"/>
-        <w:numPr>
-          <w:ilvl w:val="0"/>
-          <w:numId w:val="42"/>
-        </w:numPr>
-        <w:keepLines/>
-      </w:pPr>
-      <w:r>
-        <w:rPr>
-          <w:rFonts w:ascii="Arial" w:hAnsi="Arial"/>
-          <w:b w:val="0"/>
-          <w:i w:val="0"/>
-          <w:color w:val="161F2B"/>
-          <w:sz w:val="17"/>
-        </w:rPr>
-        <w:t>Safety — First Aid CPR AED; Risk Assessment; COSHH; Work at Height; Safe Moving and Handling</w:t>
-      </w:r>
-    </w:p>
-    <w:p>
-      <w:pPr>
-        <w:spacing w:after="30" w:line="245" w:lineRule="auto"/>
-        <w:numPr>
-          <w:ilvl w:val="0"/>
-          <w:numId w:val="42"/>
-        </w:numPr>
-        <w:keepLines/>
-      </w:pPr>
-      <w:r>
-        <w:rPr>
-          <w:rFonts w:ascii="Arial" w:hAnsi="Arial"/>
-          <w:b w:val="0"/>
-          <w:i w:val="0"/>
-          <w:color w:val="161F2B"/>
-          <w:sz w:val="17"/>
-        </w:rPr>
-        <w:t>Five current UAE tour-guide licences — Abu Dhabi, Dubai, Sharjah, Ras Al Khaimah and Louvre Abu Dhabi</w:t>
-      </w:r>
-    </w:p>
-    <w:p>
-      <w:pPr>
-        <w:spacing w:before="140" w:after="80"/>
-        <w:pBdr>
-          <w:bottom w:val="single" w:sz="6" w:space="3" w:color="9A6F1B"/>
-        </w:pBdr>
-        <w:keepNext/>
-        <w:keepLines/>
-      </w:pPr>
-      <w:r>
-        <w:rPr>
-          <w:rFonts w:ascii="Arial" w:hAnsi="Arial"/>
-          <w:b/>
-          <w:i w:val="0"/>
-          <w:color w:val="071A32"/>
-          <w:sz w:val="21"/>
-        </w:rPr>
-        <w:t>LANGUAGES, SYSTEMS &amp; ADDITIONAL INFORMATION</w:t>
-      </w:r>
-    </w:p>
-    <w:p>
-      <w:pPr>
-        <w:spacing w:after="30" w:line="245" w:lineRule="auto"/>
-        <w:numPr>
-          <w:ilvl w:val="0"/>
-          <w:numId w:val="42"/>
-        </w:numPr>
-        <w:keepLines/>
-      </w:pPr>
-      <w:r>
-        <w:rPr>
-          <w:rFonts w:ascii="Arial" w:hAnsi="Arial"/>
-          <w:b w:val="0"/>
-          <w:i w:val="0"/>
-          <w:color w:val="161F2B"/>
-          <w:sz w:val="17"/>
-        </w:rPr>
-        <w:t>Languages: Arabic — Native/Fluent; French — Fluent; English — Advanced; Russian — Intermediate</w:t>
-      </w:r>
-    </w:p>
-    <w:p>
-      <w:pPr>
-        <w:spacing w:after="30" w:line="245" w:lineRule="auto"/>
-        <w:numPr>
-          <w:ilvl w:val="0"/>
-          <w:numId w:val="42"/>
-        </w:numPr>
-        <w:keepLines/>
-      </w:pPr>
-      <w:r>
-        <w:rPr>
-          <w:rFonts w:ascii="Arial" w:hAnsi="Arial"/>
-          <w:b w:val="0"/>
-          <w:i w:val="0"/>
-          <w:color w:val="161F2B"/>
-          <w:sz w:val="17"/>
-        </w:rPr>
-        <w:t>Systems and methods: Juniper, Freshdesk, reporting, document control, process mapping, operational workflows and browser-based static tools</w:t>
-      </w:r>
-    </w:p>
-    <w:p>
-      <w:pPr>
-        <w:spacing w:after="30" w:line="245" w:lineRule="auto"/>
-        <w:numPr>
-          <w:ilvl w:val="0"/>
-          <w:numId w:val="42"/>
-        </w:numPr>
-        <w:keepLines/>
-      </w:pPr>
-      <w:r>
-        <w:rPr>
-          <w:rFonts w:ascii="Arial" w:hAnsi="Arial"/>
-          <w:b w:val="0"/>
-          <w:i w:val="0"/>
-          <w:color w:val="161F2B"/>
-          <w:sz w:val="17"/>
-        </w:rPr>
-        <w:t>Leadership development: First Time Leading Others — Miral Experiences, 2025</w:t>
-      </w:r>
-    </w:p>
-    <w:p>
-      <w:pPr>
-        <w:spacing w:after="30" w:line="245" w:lineRule="auto"/>
-        <w:numPr>
-          <w:ilvl w:val="0"/>
-          <w:numId w:val="42"/>
-        </w:numPr>
-        <w:keepLines/>
-      </w:pPr>
-      <w:r>
-        <w:rPr>
-          <w:rFonts w:ascii="Arial" w:hAnsi="Arial"/>
-          <w:b w:val="0"/>
-          <w:i w:val="0"/>
-          <w:color w:val="161F2B"/>
-          <w:sz w:val="17"/>
-        </w:rPr>
-        <w:t>Portfolio and credential evidence available at ahmedqualityops.com and through the linked professional profiles.</w:t>
+        <w:t>Five UAE guide licences/authorisations: Abu Dhabi, Dubai, Sharjah, Ras Al Khaimah and Louvre Abu Dhabi. UAE manual driving licence; first aid, food safety, COSHH and additional field/safety training.</w:t>
       </w:r>
     </w:p>
     <w:sectPr>
-      <w:footerReference w:type="default" r:id="rId11"/>
-      <w:pgSz w:w="12240" w:h="15840"/>
-      <w:pgMar w:top="792" w:right="936" w:bottom="749" w:left="936" w:header="360" w:footer="360" w:gutter="0"/>
+      <w:footerReference w:type="default" r:id="rId9"/>
+      <w:pgSz w:w="11909" w:h="16834"/>
+      <w:pgMar w:top="792" w:right="936" w:bottom="792" w:left="936" w:header="720" w:footer="720" w:gutter="0"/>
       <w:cols w:space="720"/>
       <w:docGrid w:linePitch="360"/>
     </w:sectPr>
@@ -1246,18 +352,15 @@
   <w:p>
     <w:pPr>
       <w:pStyle w:val="Footer"/>
-      <w:jc w:val="center"/>
+      <w:jc w:val="right"/>
     </w:pPr>
     <w:r>
       <w:rPr>
-        <w:rFonts w:ascii="Arial" w:hAnsi="Arial"/>
-        <w:b w:val="0"/>
-        <w:i w:val="0"/>
-        <w:color w:val="4F5B6C"/>
-        <w:sz w:val="15"/>
-      </w:rPr>
-      <w:t>Ahmed Mahmoud | Managerial CV | Tourism Operations × Product Operations</w:t>
+        <w:sz w:val="16"/>
+      </w:rPr>
+      <w:t xml:space="preserve">Ahmed Mahmoud | Updated 8 October 2026 | </w:t>
     </w:r>
+    <w:fldSimple w:instr="PAGE"/>
   </w:p>
 </w:ftr>
 </file>
@@ -1461,24 +564,6 @@
   </w:num>
   <w:num w:numId="9">
     <w:abstractNumId w:val="0"/>
-  </w:num>
-  <w:abstractNum w:abstractNumId="42">
-    <w:lvl w:ilvl="0">
-      <w:start w:val="1"/>
-      <w:numFmt w:val="bullet"/>
-      <w:lvlText w:val="•"/>
-      <w:lvlJc w:val="left"/>
-      <w:pPr>
-        <w:tabs>
-          <w:tab w:val="num" w:pos="360"/>
-        </w:tabs>
-        <w:ind w:left="360" w:hanging="180"/>
-        <w:spacing w:after="30" w:line="230" w:lineRule="auto"/>
-      </w:pPr>
-    </w:lvl>
-  </w:abstractNum>
-  <w:num w:numId="42">
-    <w:abstractNumId w:val="42"/>
   </w:num>
 </w:numbering>
 </file>
@@ -1644,12 +729,11 @@
     <w:qFormat/>
     <w:rsid w:val="00FC693F"/>
     <w:pPr>
-      <w:spacing w:after="40" w:line="252" w:lineRule="auto"/>
+      <w:spacing w:after="100" w:line="252" w:lineRule="auto"/>
     </w:pPr>
     <w:rPr>
-      <w:rFonts w:ascii="Arial" w:hAnsi="Arial"/>
-      <w:color w:val="161F2B"/>
-      <w:sz w:val="18"/>
+      <w:rFonts w:ascii="Calibri" w:hAnsi="Calibri"/>
+      <w:sz w:val="20"/>
     </w:rPr>
   </w:style>
   <w:style w:type="paragraph" w:styleId="Header">
@@ -1707,15 +791,15 @@
     <w:pPr>
       <w:keepNext/>
       <w:keepLines/>
-      <w:spacing w:before="480" w:after="0"/>
+      <w:spacing w:before="200" w:after="80"/>
       <w:outlineLvl w:val="0"/>
     </w:pPr>
     <w:rPr>
-      <w:rFonts w:asciiTheme="majorHAnsi" w:eastAsiaTheme="majorEastAsia" w:hAnsiTheme="majorHAnsi" w:cstheme="majorBidi"/>
+      <w:rFonts w:asciiTheme="majorHAnsi" w:eastAsiaTheme="majorEastAsia" w:hAnsiTheme="majorHAnsi" w:cstheme="majorBidi" w:ascii="Calibri" w:hAnsi="Calibri"/>
       <w:b/>
       <w:bCs/>
-      <w:color w:val="365F91" w:themeColor="accent1" w:themeShade="BF"/>
-      <w:sz w:val="28"/>
+      <w:color w:val="10283F"/>
+      <w:sz w:val="24"/>
       <w:szCs w:val="28"/>
     </w:rPr>
   </w:style>
@@ -1731,15 +815,15 @@
     <w:pPr>
       <w:keepNext/>
       <w:keepLines/>
-      <w:spacing w:before="200" w:after="0"/>
+      <w:spacing w:before="200" w:after="80"/>
       <w:outlineLvl w:val="1"/>
     </w:pPr>
     <w:rPr>
-      <w:rFonts w:asciiTheme="majorHAnsi" w:eastAsiaTheme="majorEastAsia" w:hAnsiTheme="majorHAnsi" w:cstheme="majorBidi"/>
+      <w:rFonts w:asciiTheme="majorHAnsi" w:eastAsiaTheme="majorEastAsia" w:hAnsiTheme="majorHAnsi" w:cstheme="majorBidi" w:ascii="Calibri" w:hAnsi="Calibri"/>
       <w:b/>
       <w:bCs/>
-      <w:color w:val="4F81BD" w:themeColor="accent1"/>
-      <w:sz w:val="26"/>
+      <w:color w:val="10283F"/>
+      <w:sz w:val="21"/>
       <w:szCs w:val="26"/>
     </w:rPr>
   </w:style>
@@ -1993,18 +1077,15 @@
     <w:qFormat/>
     <w:rsid w:val="00FC693F"/>
     <w:pPr>
-      <w:pBdr>
-        <w:bottom w:val="single" w:sz="8" w:space="4" w:color="4F81BD" w:themeColor="accent1"/>
-      </w:pBdr>
-      <w:spacing w:after="300" w:line="240" w:lineRule="auto"/>
+      <w:spacing w:after="60" w:line="240" w:lineRule="auto"/>
       <w:contextualSpacing/>
     </w:pPr>
     <w:rPr>
-      <w:rFonts w:asciiTheme="majorHAnsi" w:eastAsiaTheme="majorEastAsia" w:hAnsiTheme="majorHAnsi" w:cstheme="majorBidi"/>
-      <w:color w:val="17365D" w:themeColor="text2" w:themeShade="BF"/>
+      <w:rFonts w:asciiTheme="majorHAnsi" w:eastAsiaTheme="majorEastAsia" w:hAnsiTheme="majorHAnsi" w:cstheme="majorBidi" w:ascii="Calibri" w:hAnsi="Calibri"/>
+      <w:color w:val="000000"/>
       <w:spacing w:val="5"/>
       <w:kern w:val="28"/>
-      <w:sz w:val="52"/>
+      <w:sz w:val="48"/>
       <w:szCs w:val="52"/>
     </w:rPr>
   </w:style>
@@ -2480,9 +1561,6 @@
     <w:qFormat/>
     <w:rsid w:val="00FC693F"/>
     <w:pPr>
-      <w:pBdr>
-        <w:bottom w:val="single" w:sz="4" w:space="4" w:color="4F81BD" w:themeColor="accent1"/>
-      </w:pBdr>
       <w:spacing w:before="200" w:after="280"/>
       <w:ind w:left="936" w:right="936"/>
     </w:pPr>

</xml_diff>

<commit_message>
Polish portfolio pages, reconcile credentials and refresh public CV
</commit_message>
<xml_diff>
--- a/documents/Ahmed-Mahmoud-Managerial-CV.docx
+++ b/documents/Ahmed-Mahmoud-Managerial-CV.docx
@@ -11,22 +11,26 @@
       </w:r>
     </w:p>
     <w:p>
+      <w:pPr>
+        <w:pStyle w:val="Heading2"/>
+      </w:pPr>
       <w:r>
-        <w:rPr>
-          <w:b/>
-          <w:sz w:val="26"/>
-        </w:rPr>
         <w:t>Travel and Tourism Operations</w:t>
       </w:r>
     </w:p>
     <w:p>
       <w:r>
-        <w:t>Destination Management | Service Quality | Process Improvement</w:t>
+        <w:t>DMC &amp; MICE | B2B Reservations | Service Quality &amp; Process Improvement</w:t>
       </w:r>
     </w:p>
     <w:p>
       <w:r>
         <w:t>Netherlands | +31 6 2889 5967 | ahmed.mahmoud.nl.work@gmail.com</w:t>
+      </w:r>
+    </w:p>
+    <w:p>
+      <w:r>
+        <w:t>Authorised to work in the Netherlands. No employer sponsorship required.</w:t>
       </w:r>
     </w:p>
     <w:p>
@@ -44,7 +48,7 @@
     </w:p>
     <w:p>
       <w:r>
-        <w:t>13 years in travel, tourism and hospitality across Egypt and the UAE, now based in the Netherlands. Experience spans destination management, multilingual guest services, MICE and FAM support, B2B accommodation operations, transport coordination and travel consulting. Combines practical delivery with Lean Six Sigma, SOP development, tourism product research and operational workflow design.</w:t>
+        <w:t>13 years in travel, tourism and hospitality across Egypt and the UAE, now based in the Netherlands. My work connects destination and DMC operations, B2B reservations, guest and supplier coordination, transport planning and process improvement.</w:t>
       </w:r>
     </w:p>
     <w:p>
@@ -52,12 +56,32 @@
         <w:pStyle w:val="Heading1"/>
       </w:pPr>
       <w:r>
-        <w:t>Core Capabilities</w:t>
+        <w:t>Professional Qualifications</w:t>
       </w:r>
     </w:p>
     <w:p>
       <w:r>
-        <w:t>Destination and DMC operations; guest and supplier coordination; service recovery; MICE support; transport and fleet planning; quotation and commercial workflows; SOPs and handovers; quality and process improvement; product discovery; multilingual content operations.</w:t>
+        <w:t>Certified Associate in Project Management (CAPM) | Project Management Institute | 26 April 2024 - 26 April 2027</w:t>
+      </w:r>
+    </w:p>
+    <w:p>
+      <w:r>
+        <w:t>Lean Six Sigma Black Belt training certificate | Anexas Europe / Miral LLC | July 2025</w:t>
+      </w:r>
+    </w:p>
+    <w:p>
+      <w:r>
+        <w:t>ITIL 4 Foundation | PeopleCert / AXELOS | 1 August 2024 - 1 August 2027</w:t>
+      </w:r>
+    </w:p>
+    <w:p>
+      <w:r>
+        <w:t>Professional Certified Marketer (PCM) | American Marketing Association | July 2025 - July 2028</w:t>
+      </w:r>
+    </w:p>
+    <w:p>
+      <w:r>
+        <w:t>CompTIA IT Fundamentals (ITF+) | CompTIA | June 2024</w:t>
       </w:r>
     </w:p>
     <w:p>
@@ -65,7 +89,28 @@
         <w:pStyle w:val="Heading1"/>
       </w:pPr>
       <w:r>
-        <w:t>Professional Experience</w:t>
+        <w:t>IATA Diplomas</w:t>
+      </w:r>
+    </w:p>
+    <w:p>
+      <w:r>
+        <w:t>Travel Operations Management (March 2026) • MICE and Sales (July 2025) • Special Cargo Handling (January 2025) • Tour Production (September 2024) • Travel and Tourism Consultant (May 2021)</w:t>
+      </w:r>
+    </w:p>
+    <w:p>
+      <w:pPr>
+        <w:pStyle w:val="Heading1"/>
+      </w:pPr>
+      <w:r>
+        <w:t>Career Experience — Departments and Contributions</w:t>
+      </w:r>
+    </w:p>
+    <w:p>
+      <w:pPr>
+        <w:pStyle w:val="Heading2"/>
+      </w:pPr>
+      <w:r>
+        <w:t>Masarra DMC - Miral Experiences | Abu Dhabi, UAE</w:t>
       </w:r>
     </w:p>
     <w:p>
@@ -73,20 +118,20 @@
         <w:rPr>
           <w:b/>
         </w:rPr>
-        <w:t>Licensed Tour Guide and Cross Functional DMC Operations Support</w:t>
+        <w:t>Operations Department | From December 2024</w:t>
+      </w:r>
+    </w:p>
+    <w:p>
+      <w:r>
+        <w:t>Supported approximately 350 guests per month and groups up to 45 through destination services, transport, ticketing, supplier coordination and service recovery. Contributed to MICE, FAM and industry-event operations, including airport and hotel representation, guest movements, venues and live stakeholder communication. Developed airport-representative procedures and operational handovers; supported Strapi Arabic localisation, BOS and Otolo Homes workflows, colleague coaching and a Travel Desk DMAIC project.</w:t>
       </w:r>
     </w:p>
     <w:p>
       <w:pPr>
-        <w:spacing w:after="60"/>
+        <w:pStyle w:val="Heading2"/>
       </w:pPr>
       <w:r>
-        <w:t>Masarra DMC - Miral Experiences, Abu Dhabi | Started Dec 2024</w:t>
-      </w:r>
-    </w:p>
-    <w:p>
-      <w:r>
-        <w:t>French and English destination delivery, approximately 350 guests per month and groups up to 45. Contributions included MICE/FAM support, airport-representative procedures, Arabic localisation in Strapi, BOS/Otolo Homes workflows, informal colleague coaching and a Travel Desk improvement project.</w:t>
+        <w:t>Oceanair Travels | Dubai, UAE</w:t>
       </w:r>
     </w:p>
     <w:p>
@@ -94,20 +139,20 @@
         <w:rPr>
           <w:b/>
         </w:rPr>
-        <w:t>Licensed Tour Guide</w:t>
+        <w:t>Operations Department | September 2022 - November 2024</w:t>
+      </w:r>
+    </w:p>
+    <w:p>
+      <w:r>
+        <w:t>Coordinated destination programmes for international groups up to 35, including hotel pickups, transport, tickets, attractions, timing and supplier interfaces. Protected itinerary continuity during delays and live changes through multilingual guest communication and service recovery.</w:t>
       </w:r>
     </w:p>
     <w:p>
       <w:pPr>
-        <w:spacing w:after="60"/>
+        <w:pStyle w:val="Heading2"/>
       </w:pPr>
       <w:r>
-        <w:t>Oceanair Travels, Dubai | Sep 2022 - Nov 2024</w:t>
-      </w:r>
-    </w:p>
-    <w:p>
-      <w:r>
-        <w:t>Delivered multilingual destination experiences for groups up to 35; coordinated guest needs, timing, supplier interfaces and live disruptions.</w:t>
+        <w:t>WebBeds Middle East &amp; Africa | Cairo, Egypt</w:t>
       </w:r>
     </w:p>
     <w:p>
@@ -115,83 +160,12 @@
         <w:rPr>
           <w:b/>
         </w:rPr>
-        <w:t>Operations Executive B2B Accommodation</w:t>
-      </w:r>
-    </w:p>
-    <w:p>
-      <w:pPr>
-        <w:spacing w:after="60"/>
-      </w:pPr>
-      <w:r>
-        <w:t>WebBeds MEA, Cairo | Jun 2022 - Sep 2022</w:t>
+        <w:t>Reservations and B2B Operations | June 2022 - September 2022</w:t>
       </w:r>
     </w:p>
     <w:p>
       <w:r>
-        <w:t>Handled an average of approximately 120 daily cases for French-speaking North African markets. Used Juniper and Freshdesk for booking issues, relocations, rates, refunds and partner communication.</w:t>
-      </w:r>
-    </w:p>
-    <w:p>
-      <w:r>
-        <w:rPr>
-          <w:b/>
-        </w:rPr>
-        <w:t>Tour Leader</w:t>
-      </w:r>
-    </w:p>
-    <w:p>
-      <w:pPr>
-        <w:spacing w:after="60"/>
-      </w:pPr>
-      <w:r>
-        <w:t>Fun &amp; Sun / TUI CIS, Sharm El Sheikh | Jul 2021 - Apr 2022</w:t>
-      </w:r>
-    </w:p>
-    <w:p>
-      <w:r>
-        <w:t>Supported excursion sales, transfers and guest services for groups up to 19, coordinating daily arrangements and resolving service issues.</w:t>
-      </w:r>
-    </w:p>
-    <w:p>
-      <w:r>
-        <w:rPr>
-          <w:b/>
-        </w:rPr>
-        <w:t>Operations Coordinator Transport and Fleet</w:t>
-      </w:r>
-    </w:p>
-    <w:p>
-      <w:pPr>
-        <w:spacing w:after="60"/>
-      </w:pPr>
-      <w:r>
-        <w:t>Alnatalie Red Sea Tours, Cairo | Jan 2020 - Jun 2021</w:t>
-      </w:r>
-    </w:p>
-    <w:p>
-      <w:r>
-        <w:t>Coordinated approximately 15 vehicles, driver allocation, maintenance, insurance and GPS follow-up. Supported transport operations during the 2021 IHF championship.</w:t>
-      </w:r>
-    </w:p>
-    <w:p>
-      <w:r>
-        <w:rPr>
-          <w:b/>
-        </w:rPr>
-        <w:t>Travel and Tourism Consultant</w:t>
-      </w:r>
-    </w:p>
-    <w:p>
-      <w:pPr>
-        <w:spacing w:after="60"/>
-      </w:pPr>
-      <w:r>
-        <w:t>Elmadina Tours, Cairo | Jan 2013 - Jan 2020</w:t>
-      </w:r>
-    </w:p>
-    <w:p>
-      <w:r>
-        <w:t>Arranged leisure and honeymoon packages, flights, visas, suppliers and quotations; supported Hajj and Umrah group travel. Worked with SAFA and Amadeus.</w:t>
+        <w:t>Handled approximately 120 B2B booking and case transactions per day using Juniper and Freshdesk. Supported French-speaking hotel markets in Tunisia, Morocco and Algeria; resolved booking discrepancies, amendments, rates, refunds and relocations through partner and internal-team coordination.</w:t>
       </w:r>
     </w:p>
     <w:p>
@@ -204,7 +178,7 @@
         <w:pStyle w:val="Heading1"/>
       </w:pPr>
       <w:r>
-        <w:t>Selected Projects and Contributions</w:t>
+        <w:t>Ahmed Mahmoud | Career Experience continued</w:t>
       </w:r>
     </w:p>
     <w:p>
@@ -212,12 +186,83 @@
         <w:pStyle w:val="Heading2"/>
       </w:pPr>
       <w:r>
-        <w:t>Travel Desk improvement</w:t>
+        <w:t>Fun &amp; Sun / TUI CIS | Sharm El Sheikh, Egypt</w:t>
       </w:r>
     </w:p>
     <w:p>
       <w:r>
-        <w:t>2025 Lean Six Sigma Black Belt DMAIC project on strategic agent allocation. Applied statistical and cause analysis to allocation, training, multilingual materials, offers and control planning. Baseline median monthly agent sales: AED 8,059; target: AED 12,500. The AED 746,088 annual opportunity across 14 agents is projected and conditional on target achievement, not recorded realised revenue.</w:t>
+        <w:rPr>
+          <w:b/>
+        </w:rPr>
+        <w:t>Operations Department | July 2021 - April 2022</w:t>
+      </w:r>
+    </w:p>
+    <w:p>
+      <w:r>
+        <w:t>Coordinated daily destination programmes, excursions, airport arrivals, departures and transfers for multinational groups up to 19. Handled guest issues and programme changes while maintaining timing, safety and service standards, including support for CIS and Russian-speaking markets.</w:t>
+      </w:r>
+    </w:p>
+    <w:p>
+      <w:pPr>
+        <w:pStyle w:val="Heading2"/>
+      </w:pPr>
+      <w:r>
+        <w:t>Alnatalie Red Sea Tours | Cairo, Egypt</w:t>
+      </w:r>
+    </w:p>
+    <w:p>
+      <w:r>
+        <w:rPr>
+          <w:b/>
+        </w:rPr>
+        <w:t>Operations Department | January 2020 - June 2021</w:t>
+      </w:r>
+    </w:p>
+    <w:p>
+      <w:r>
+        <w:t>Coordinated approximately 15 vehicles and drivers, daily allocation, GPS follow-up, maintenance schedules, insurance administration and operational readiness. Supported transport operations connected to the 2021 IHF Men's World Championship, including movements between airports, hotels and competition venues.</w:t>
+      </w:r>
+    </w:p>
+    <w:p>
+      <w:pPr>
+        <w:pStyle w:val="Heading2"/>
+      </w:pPr>
+      <w:r>
+        <w:t>Elmadina Tours | Cairo, Egypt</w:t>
+      </w:r>
+    </w:p>
+    <w:p>
+      <w:r>
+        <w:rPr>
+          <w:b/>
+        </w:rPr>
+        <w:t>Travel and Tourism Consultant | January 2013 - January 2020</w:t>
+      </w:r>
+    </w:p>
+    <w:p>
+      <w:r>
+        <w:t>Designed, quoted and sold leisure, honeymoon and couple packages; coordinated itineraries, hotels, suppliers and customer follow-up. Managed Hajj and Umrah arrangements, flights, visas and documentation, accommodation in Makkah and Madinah, and programme coordination using SAFA and Amadeus workflows.</w:t>
+      </w:r>
+    </w:p>
+    <w:p>
+      <w:pPr>
+        <w:pStyle w:val="Heading1"/>
+      </w:pPr>
+      <w:r>
+        <w:t>Selected Projects and Recent Contributions</w:t>
+      </w:r>
+    </w:p>
+    <w:p>
+      <w:pPr>
+        <w:pStyle w:val="Heading2"/>
+      </w:pPr>
+      <w:r>
+        <w:t>Travel Desk DMAIC improvement</w:t>
+      </w:r>
+    </w:p>
+    <w:p>
+      <w:r>
+        <w:t>Lean Six Sigma workplace project on agent allocation, training, multilingual materials and control planning. Baseline median monthly agent sales: AED 8,059; target: AED 12,500. The AED 746,088 annual opportunity across 14 agents is projected and conditional on target achievement; it is not realised revenue.</w:t>
       </w:r>
     </w:p>
     <w:p>
@@ -230,7 +275,7 @@
     </w:p>
     <w:p>
       <w:r>
-        <w:t>12-part research case study connecting customer evidence, requirements, feasibility, economics and pilot controls. Pre-pilot research with an iterate decision; real departures and post-pilot outcomes are not established.</w:t>
+        <w:t>12-part research case study connecting customer evidence, requirements, supplier feasibility, unit economics and pilot controls. Pre-pilot research with an iterate decision; departures and post-pilot outcomes are not established.</w:t>
       </w:r>
     </w:p>
     <w:p>
@@ -243,53 +288,7 @@
     </w:p>
     <w:p>
       <w:r>
-        <w:t>InfraQuote: commercial quotation and margin controls. InfraDispatch: assignment review and field handovers. InfraSky: condition-aware experience readiness. InfraCluster: pickup grouping and capacity checks. Static browser demonstrations; no production integrations are claimed.</w:t>
-      </w:r>
-    </w:p>
-    <w:p>
-      <w:pPr>
-        <w:pStyle w:val="Heading1"/>
-      </w:pPr>
-      <w:r>
-        <w:t>Professional Certifications</w:t>
-      </w:r>
-    </w:p>
-    <w:p>
-      <w:r>
-        <w:t>CAPM - Project Management Institute | Jun 2025 - Jun 2028</w:t>
-        <w:br/>
-        <w:t>Lean Six Sigma Black Belt - Anexas / Miral | Jul 2025</w:t>
-        <w:br/>
-        <w:t>ITIL 4 Foundation - PeopleCert / AXELOS | Aug 2024 - Aug 2027</w:t>
-        <w:br/>
-        <w:t>Professional Certified Marketer - American Marketing Association | Jul 2025 - Jul 2028</w:t>
-        <w:br/>
-        <w:t>CompTIA IT Fundamentals | Jun 2024</w:t>
-        <w:br/>
-        <w:t>First Time Leading Others | Feb 2025</w:t>
-      </w:r>
-    </w:p>
-    <w:p>
-      <w:pPr>
-        <w:pStyle w:val="Heading1"/>
-      </w:pPr>
-      <w:r>
-        <w:t>IATA Diplomas and Travel Training</w:t>
-      </w:r>
-    </w:p>
-    <w:p>
-      <w:r>
-        <w:t>Travel Operations Management Diploma | Mar 2026</w:t>
-        <w:br/>
-        <w:t>MICE &amp; Sales Diploma | Jul 2025</w:t>
-        <w:br/>
-        <w:t>Special Cargo Handling Diploma | Jan 2025</w:t>
-        <w:br/>
-        <w:t>Tour Production Diploma | Sep 2024</w:t>
-        <w:br/>
-        <w:t>Travel &amp; Tourism Consultant Diploma | May 2021</w:t>
-        <w:br/>
-        <w:t>Additional IATA training: Transport of Pharma Products &amp; Vaccines by Air | May 2024</w:t>
+        <w:t>InfraQuote: quotation and margin controls. InfraDispatch: assignment review and field handovers. InfraSky: condition-aware readiness. InfraCluster: pickup grouping and capacity checks. Static browser MVPs; production integrations are not claimed.</w:t>
       </w:r>
     </w:p>
     <w:p>
@@ -302,7 +301,7 @@
     </w:p>
     <w:p>
       <w:r>
-        <w:t>Cairo University - Faculty of Law | Licence / Bachelor of Law | 2006 - 2010</w:t>
+        <w:t>Cairo University | Faculty of Law | Licence / Bachelor of Law | 2006–2010</w:t>
       </w:r>
     </w:p>
     <w:p>
@@ -310,17 +309,12 @@
         <w:pStyle w:val="Heading1"/>
       </w:pPr>
       <w:r>
-        <w:t>Languages and Systems</w:t>
+        <w:t>Languages</w:t>
       </w:r>
     </w:p>
     <w:p>
       <w:r>
-        <w:t>Arabic: native. English: advanced professional. French: professional, DELF B1 and 450 hours of study. Russian: working knowledge, 250 hours of study. Dutch: A1, studying.</w:t>
-      </w:r>
-    </w:p>
-    <w:p>
-      <w:r>
-        <w:t>BOS, Otolo Homes, Juniper, Freshdesk, Sriggle, SAFA, Amadeus, Strapi, Excel, Microsoft Office, Google Workspace, GitHub and HTML/JavaScript workflows.</w:t>
+        <w:t>Arabic - native; English - advanced professional; French - professional working proficiency; DELF B1 and approximately 450 study hours; Russian - working knowledge; approximately 250 study hours; Dutch - A1, actively studying.</w:t>
       </w:r>
     </w:p>
     <w:p>
@@ -328,18 +322,41 @@
         <w:pStyle w:val="Heading1"/>
       </w:pPr>
       <w:r>
-        <w:t>Licences and Field Readiness</w:t>
+        <w:t>Systems and Methods</w:t>
       </w:r>
     </w:p>
     <w:p>
       <w:r>
-        <w:t>Five UAE guide licences/authorisations: Abu Dhabi, Dubai, Sharjah, Ras Al Khaimah and Louvre Abu Dhabi. UAE manual driving licence; first aid, food safety, COSHH and additional field/safety training.</w:t>
+        <w:t>BOS System, Otolo Homes, Juniper, Freshdesk, Sriggle, SAFA, Amadeus, Strapi CMS, Excel and Microsoft Office, Google Workspace, GitHub, HTML and JavaScript.</w:t>
+      </w:r>
+    </w:p>
+    <w:p>
+      <w:r>
+        <w:t>DMAIC and root-cause analysis; SOPs, process mapping and RACI; Service recovery and KPI controls; Voice of Customer and requirements traceability; Supplier feasibility and unit economics; MVP and pilot planning.</w:t>
+      </w:r>
+    </w:p>
+    <w:p>
+      <w:pPr>
+        <w:pStyle w:val="Heading1"/>
+      </w:pPr>
+      <w:r>
+        <w:t>Leadership, Safety and Further Training</w:t>
+      </w:r>
+    </w:p>
+    <w:p>
+      <w:r>
+        <w:t>First Time Leading Others (February 2025); Highfield Level 2 COSHH, Merit (October 2025); AHA Heartsaver First Aid CPR AED (August 2025; renew by August 2027); IATA Pharma Products and Vaccines by Air (May 2024); risk assessment, work at height and safe handling; ETAA operations and sales courses (2019).</w:t>
+      </w:r>
+    </w:p>
+    <w:p>
+      <w:r>
+        <w:t>Five UAE destination authorisations; UAE manual driving licence; intermediate desert-driving training and RYA Powerboat Level 2. Further training includes food safety, maritime readiness, vehicle assessment and insurance fundamentals.</w:t>
       </w:r>
     </w:p>
     <w:sectPr>
       <w:footerReference w:type="default" r:id="rId9"/>
       <w:pgSz w:w="11909" w:h="16834"/>
-      <w:pgMar w:top="792" w:right="936" w:bottom="792" w:left="936" w:header="720" w:footer="720" w:gutter="0"/>
+      <w:pgMar w:top="720" w:right="936" w:bottom="720" w:left="936" w:header="720" w:footer="720" w:gutter="0"/>
       <w:cols w:space="720"/>
       <w:docGrid w:linePitch="360"/>
     </w:sectPr>
@@ -729,11 +746,11 @@
     <w:qFormat/>
     <w:rsid w:val="00FC693F"/>
     <w:pPr>
-      <w:spacing w:after="100" w:line="252" w:lineRule="auto"/>
+      <w:spacing w:after="80" w:line="245" w:lineRule="auto"/>
     </w:pPr>
     <w:rPr>
       <w:rFonts w:ascii="Calibri" w:hAnsi="Calibri"/>
-      <w:sz w:val="20"/>
+      <w:sz w:val="19"/>
     </w:rPr>
   </w:style>
   <w:style w:type="paragraph" w:styleId="Header">
@@ -791,7 +808,7 @@
     <w:pPr>
       <w:keepNext/>
       <w:keepLines/>
-      <w:spacing w:before="200" w:after="80"/>
+      <w:spacing w:before="160" w:after="60"/>
       <w:outlineLvl w:val="0"/>
     </w:pPr>
     <w:rPr>
@@ -799,7 +816,7 @@
       <w:b/>
       <w:bCs/>
       <w:color w:val="10283F"/>
-      <w:sz w:val="24"/>
+      <w:sz w:val="23"/>
       <w:szCs w:val="28"/>
     </w:rPr>
   </w:style>
@@ -815,7 +832,7 @@
     <w:pPr>
       <w:keepNext/>
       <w:keepLines/>
-      <w:spacing w:before="200" w:after="80"/>
+      <w:spacing w:before="160" w:after="60"/>
       <w:outlineLvl w:val="1"/>
     </w:pPr>
     <w:rPr>
@@ -823,7 +840,7 @@
       <w:b/>
       <w:bCs/>
       <w:color w:val="10283F"/>
-      <w:sz w:val="21"/>
+      <w:sz w:val="20"/>
       <w:szCs w:val="26"/>
     </w:rPr>
   </w:style>
@@ -1085,7 +1102,7 @@
       <w:color w:val="000000"/>
       <w:spacing w:val="5"/>
       <w:kern w:val="28"/>
-      <w:sz w:val="48"/>
+      <w:sz w:val="50"/>
       <w:szCs w:val="52"/>
     </w:rPr>
   </w:style>

</xml_diff>

<commit_message>
Reconcile evidence and CV, correct source claims and stabilise mobile navigation
</commit_message>
<xml_diff>
--- a/documents/Ahmed-Mahmoud-Managerial-CV.docx
+++ b/documents/Ahmed-Mahmoud-Managerial-CV.docx
@@ -48,7 +48,7 @@
     </w:p>
     <w:p>
       <w:r>
-        <w:t>13 years in travel, tourism and hospitality across Egypt and the UAE, now based in the Netherlands. My work connects destination and DMC operations, B2B reservations, guest and supplier coordination, transport planning and process improvement.</w:t>
+        <w:t>13 years in Travel and Tourism and hospitality across Egypt and the UAE, now based in the Netherlands. My work connects destination and DMC operations, B2B reservations, guest and supplier coordination, transport planning and process improvement.</w:t>
       </w:r>
     </w:p>
     <w:p>
@@ -76,12 +76,12 @@
     </w:p>
     <w:p>
       <w:r>
-        <w:t>Professional Certified Marketer (PCM) | American Marketing Association | July 2025 - July 2028</w:t>
+        <w:t>Professional Certified Marketer (PCM) | American Marketing Association | July 2025 - July 2028 | Master CV record</w:t>
       </w:r>
     </w:p>
     <w:p>
       <w:r>
-        <w:t>CompTIA IT Fundamentals (ITF+) | CompTIA | June 2024</w:t>
+        <w:t>CompTIA IT Fundamentals (ITF+) | CompTIA | June 2024 | Master CV record</w:t>
       </w:r>
     </w:p>
     <w:p>
@@ -94,7 +94,7 @@
     </w:p>
     <w:p>
       <w:r>
-        <w:t>Travel Operations Management (March 2026) • MICE and Sales (July 2025) • Special Cargo Handling (January 2025) • Tour Production (September 2024) • Travel and Tourism Consultant (May 2021)</w:t>
+        <w:t>Travel Operations (self-study) (March 2026) • MICE and Sales (July 2025) • Special Cargo Handling (January 2025) • Tour Production (September 2024) • Travel and Tourism Consultant (May 2021)</w:t>
       </w:r>
     </w:p>
     <w:p>

</xml_diff>